<commit_message>
commit brand sturcture update
</commit_message>
<xml_diff>
--- a/modules/brand/docs/Better Brand Health CBMquestionnaireTemplate Trans only example.docx
+++ b/modules/brand/docs/Better Brand Health CBMquestionnaireTemplate Trans only example.docx
@@ -1332,6 +1332,248 @@
             <w:pPr>
               <w:spacing w:after="60"/>
               <w:jc w:val="right"/>
+            </w:pPr>
+            <w:r>
+              <w:rPr>
+                <w:rFonts w:ascii="Aptos" w:hAnsi="Aptos"/>
+                <w:sz w:val="20"/>
+                <w:szCs w:val="20"/>
+              </w:rPr>
+              <w:t>Salad Dressings</w:t>
+            </w:r>
+          </w:p>
+        </w:tc>
+        <w:tc>
+          <w:tcPr>
+            <w:tcW w:w="759" w:type="pct"/>
+          </w:tcPr>
+          <w:p>
+            <w:pPr>
+              <w:spacing w:after="60"/>
+              <w:jc w:val="center"/>
+              <w:rPr>
+                <w:rFonts w:ascii="Arial" w:hAnsi="Arial" w:cs="Arial"/>
+                <w:sz w:val="20"/>
+                <w:szCs w:val="20"/>
+              </w:rPr>
+            </w:pPr>
+            <w:r>
+              <w:rPr>
+                <w:rFonts w:ascii="Arial" w:hAnsi="Arial" w:cs="Arial"/>
+                <w:sz w:val="20"/>
+                <w:szCs w:val="20"/>
+              </w:rPr>
+              <w:t>5</w:t>
+            </w:r>
+          </w:p>
+        </w:tc>
+      </w:tr>
+      <w:tr>
+        <w:trPr>
+          <w:cantSplit/>
+        </w:trPr>
+        <w:tc>
+          <w:tcPr>
+            <w:tcW w:w="4241" w:type="pct"/>
+          </w:tcPr>
+          <w:p>
+            <w:pPr>
+              <w:spacing w:after="60"/>
+              <w:jc w:val="right"/>
+            </w:pPr>
+            <w:r>
+              <w:rPr>
+                <w:rFonts w:ascii="Aptos" w:hAnsi="Aptos"/>
+                <w:sz w:val="20"/>
+                <w:szCs w:val="20"/>
+              </w:rPr>
+              <w:t>Stock Powder / Liquid</w:t>
+            </w:r>
+          </w:p>
+        </w:tc>
+        <w:tc>
+          <w:tcPr>
+            <w:tcW w:w="759" w:type="pct"/>
+          </w:tcPr>
+          <w:p>
+            <w:pPr>
+              <w:spacing w:after="60"/>
+              <w:jc w:val="center"/>
+              <w:rPr>
+                <w:rFonts w:ascii="Arial" w:hAnsi="Arial" w:cs="Arial"/>
+                <w:sz w:val="20"/>
+                <w:szCs w:val="20"/>
+              </w:rPr>
+            </w:pPr>
+            <w:r>
+              <w:rPr>
+                <w:rFonts w:ascii="Arial" w:hAnsi="Arial" w:cs="Arial"/>
+                <w:sz w:val="20"/>
+                <w:szCs w:val="20"/>
+              </w:rPr>
+              <w:t>6</w:t>
+            </w:r>
+          </w:p>
+        </w:tc>
+      </w:tr>
+      <w:tr>
+        <w:trPr>
+          <w:cantSplit/>
+        </w:trPr>
+        <w:tc>
+          <w:tcPr>
+            <w:tcW w:w="4241" w:type="pct"/>
+          </w:tcPr>
+          <w:p>
+            <w:pPr>
+              <w:spacing w:after="60"/>
+              <w:jc w:val="right"/>
+            </w:pPr>
+            <w:proofErr w:type="spellStart"/>
+            <w:r>
+              <w:rPr>
+                <w:rFonts w:ascii="Aptos" w:hAnsi="Aptos"/>
+                <w:sz w:val="20"/>
+                <w:szCs w:val="20"/>
+              </w:rPr>
+              <w:t>Pestos</w:t>
+            </w:r>
+            <w:proofErr w:type="spellEnd"/>
+          </w:p>
+        </w:tc>
+        <w:tc>
+          <w:tcPr>
+            <w:tcW w:w="759" w:type="pct"/>
+          </w:tcPr>
+          <w:p>
+            <w:pPr>
+              <w:spacing w:after="60"/>
+              <w:jc w:val="center"/>
+              <w:rPr>
+                <w:rFonts w:ascii="Arial" w:hAnsi="Arial" w:cs="Arial"/>
+                <w:sz w:val="20"/>
+                <w:szCs w:val="20"/>
+              </w:rPr>
+            </w:pPr>
+            <w:r>
+              <w:rPr>
+                <w:rFonts w:ascii="Arial" w:hAnsi="Arial" w:cs="Arial"/>
+                <w:sz w:val="20"/>
+                <w:szCs w:val="20"/>
+              </w:rPr>
+              <w:t>7</w:t>
+            </w:r>
+          </w:p>
+        </w:tc>
+      </w:tr>
+      <w:tr>
+        <w:trPr>
+          <w:cantSplit/>
+        </w:trPr>
+        <w:tc>
+          <w:tcPr>
+            <w:tcW w:w="4241" w:type="pct"/>
+          </w:tcPr>
+          <w:p>
+            <w:pPr>
+              <w:spacing w:after="60"/>
+              <w:jc w:val="right"/>
+            </w:pPr>
+            <w:r>
+              <w:rPr>
+                <w:rFonts w:ascii="Aptos" w:hAnsi="Aptos"/>
+                <w:sz w:val="20"/>
+                <w:szCs w:val="20"/>
+              </w:rPr>
+              <w:t>Cook-in Sauces</w:t>
+            </w:r>
+          </w:p>
+        </w:tc>
+        <w:tc>
+          <w:tcPr>
+            <w:tcW w:w="759" w:type="pct"/>
+          </w:tcPr>
+          <w:p>
+            <w:pPr>
+              <w:spacing w:after="60"/>
+              <w:jc w:val="center"/>
+              <w:rPr>
+                <w:rFonts w:ascii="Arial" w:hAnsi="Arial" w:cs="Arial"/>
+                <w:sz w:val="20"/>
+                <w:szCs w:val="20"/>
+              </w:rPr>
+            </w:pPr>
+            <w:r>
+              <w:rPr>
+                <w:rFonts w:ascii="Arial" w:hAnsi="Arial" w:cs="Arial"/>
+                <w:sz w:val="20"/>
+                <w:szCs w:val="20"/>
+              </w:rPr>
+              <w:t>8</w:t>
+            </w:r>
+          </w:p>
+        </w:tc>
+      </w:tr>
+      <w:tr>
+        <w:trPr>
+          <w:cantSplit/>
+        </w:trPr>
+        <w:tc>
+          <w:tcPr>
+            <w:tcW w:w="4241" w:type="pct"/>
+          </w:tcPr>
+          <w:p>
+            <w:pPr>
+              <w:spacing w:after="60"/>
+              <w:jc w:val="right"/>
+            </w:pPr>
+            <w:r>
+              <w:rPr>
+                <w:rFonts w:ascii="Aptos" w:hAnsi="Aptos"/>
+                <w:sz w:val="20"/>
+                <w:szCs w:val="20"/>
+              </w:rPr>
+              <w:t>Anti-pasta</w:t>
+            </w:r>
+          </w:p>
+        </w:tc>
+        <w:tc>
+          <w:tcPr>
+            <w:tcW w:w="759" w:type="pct"/>
+          </w:tcPr>
+          <w:p>
+            <w:pPr>
+              <w:spacing w:after="60"/>
+              <w:jc w:val="center"/>
+              <w:rPr>
+                <w:rFonts w:ascii="Arial" w:hAnsi="Arial" w:cs="Arial"/>
+                <w:sz w:val="20"/>
+                <w:szCs w:val="20"/>
+              </w:rPr>
+            </w:pPr>
+            <w:r>
+              <w:rPr>
+                <w:rFonts w:ascii="Arial" w:hAnsi="Arial" w:cs="Arial"/>
+                <w:sz w:val="20"/>
+                <w:szCs w:val="20"/>
+              </w:rPr>
+              <w:t>9</w:t>
+            </w:r>
+          </w:p>
+        </w:tc>
+      </w:tr>
+      <w:tr>
+        <w:trPr>
+          <w:cantSplit/>
+        </w:trPr>
+        <w:tc>
+          <w:tcPr>
+            <w:tcW w:w="4241" w:type="pct"/>
+          </w:tcPr>
+          <w:p>
+            <w:pPr>
+              <w:spacing w:after="60"/>
+              <w:jc w:val="right"/>
               <w:rPr>
                 <w:rFonts w:ascii="Arial" w:hAnsi="Arial" w:cs="Arial"/>
                 <w:sz w:val="20"/>
@@ -1911,6 +2153,248 @@
             <w:pPr>
               <w:spacing w:after="60"/>
               <w:jc w:val="right"/>
+            </w:pPr>
+            <w:r>
+              <w:rPr>
+                <w:rFonts w:ascii="Aptos" w:hAnsi="Aptos"/>
+                <w:sz w:val="20"/>
+                <w:szCs w:val="20"/>
+              </w:rPr>
+              <w:t>Salad Dressings</w:t>
+            </w:r>
+          </w:p>
+        </w:tc>
+        <w:tc>
+          <w:tcPr>
+            <w:tcW w:w="759" w:type="pct"/>
+          </w:tcPr>
+          <w:p>
+            <w:pPr>
+              <w:spacing w:after="60"/>
+              <w:jc w:val="center"/>
+              <w:rPr>
+                <w:rFonts w:ascii="Arial" w:hAnsi="Arial" w:cs="Arial"/>
+                <w:sz w:val="20"/>
+                <w:szCs w:val="20"/>
+              </w:rPr>
+            </w:pPr>
+            <w:r>
+              <w:rPr>
+                <w:rFonts w:ascii="Arial" w:hAnsi="Arial" w:cs="Arial"/>
+                <w:sz w:val="20"/>
+                <w:szCs w:val="20"/>
+              </w:rPr>
+              <w:t>5</w:t>
+            </w:r>
+          </w:p>
+        </w:tc>
+      </w:tr>
+      <w:tr>
+        <w:trPr>
+          <w:cantSplit/>
+        </w:trPr>
+        <w:tc>
+          <w:tcPr>
+            <w:tcW w:w="4241" w:type="pct"/>
+          </w:tcPr>
+          <w:p>
+            <w:pPr>
+              <w:spacing w:after="60"/>
+              <w:jc w:val="right"/>
+            </w:pPr>
+            <w:r>
+              <w:rPr>
+                <w:rFonts w:ascii="Aptos" w:hAnsi="Aptos"/>
+                <w:sz w:val="20"/>
+                <w:szCs w:val="20"/>
+              </w:rPr>
+              <w:t>Stock Powder / Liquid</w:t>
+            </w:r>
+          </w:p>
+        </w:tc>
+        <w:tc>
+          <w:tcPr>
+            <w:tcW w:w="759" w:type="pct"/>
+          </w:tcPr>
+          <w:p>
+            <w:pPr>
+              <w:spacing w:after="60"/>
+              <w:jc w:val="center"/>
+              <w:rPr>
+                <w:rFonts w:ascii="Arial" w:hAnsi="Arial" w:cs="Arial"/>
+                <w:sz w:val="20"/>
+                <w:szCs w:val="20"/>
+              </w:rPr>
+            </w:pPr>
+            <w:r>
+              <w:rPr>
+                <w:rFonts w:ascii="Arial" w:hAnsi="Arial" w:cs="Arial"/>
+                <w:sz w:val="20"/>
+                <w:szCs w:val="20"/>
+              </w:rPr>
+              <w:t>6</w:t>
+            </w:r>
+          </w:p>
+        </w:tc>
+      </w:tr>
+      <w:tr>
+        <w:trPr>
+          <w:cantSplit/>
+        </w:trPr>
+        <w:tc>
+          <w:tcPr>
+            <w:tcW w:w="4241" w:type="pct"/>
+          </w:tcPr>
+          <w:p>
+            <w:pPr>
+              <w:spacing w:after="60"/>
+              <w:jc w:val="right"/>
+            </w:pPr>
+            <w:proofErr w:type="spellStart"/>
+            <w:r>
+              <w:rPr>
+                <w:rFonts w:ascii="Aptos" w:hAnsi="Aptos"/>
+                <w:sz w:val="20"/>
+                <w:szCs w:val="20"/>
+              </w:rPr>
+              <w:t>Pestos</w:t>
+            </w:r>
+            <w:proofErr w:type="spellEnd"/>
+          </w:p>
+        </w:tc>
+        <w:tc>
+          <w:tcPr>
+            <w:tcW w:w="759" w:type="pct"/>
+          </w:tcPr>
+          <w:p>
+            <w:pPr>
+              <w:spacing w:after="60"/>
+              <w:jc w:val="center"/>
+              <w:rPr>
+                <w:rFonts w:ascii="Arial" w:hAnsi="Arial" w:cs="Arial"/>
+                <w:sz w:val="20"/>
+                <w:szCs w:val="20"/>
+              </w:rPr>
+            </w:pPr>
+            <w:r>
+              <w:rPr>
+                <w:rFonts w:ascii="Arial" w:hAnsi="Arial" w:cs="Arial"/>
+                <w:sz w:val="20"/>
+                <w:szCs w:val="20"/>
+              </w:rPr>
+              <w:t>7</w:t>
+            </w:r>
+          </w:p>
+        </w:tc>
+      </w:tr>
+      <w:tr>
+        <w:trPr>
+          <w:cantSplit/>
+        </w:trPr>
+        <w:tc>
+          <w:tcPr>
+            <w:tcW w:w="4241" w:type="pct"/>
+          </w:tcPr>
+          <w:p>
+            <w:pPr>
+              <w:spacing w:after="60"/>
+              <w:jc w:val="right"/>
+            </w:pPr>
+            <w:r>
+              <w:rPr>
+                <w:rFonts w:ascii="Aptos" w:hAnsi="Aptos"/>
+                <w:sz w:val="20"/>
+                <w:szCs w:val="20"/>
+              </w:rPr>
+              <w:t>Cook-in Sauces</w:t>
+            </w:r>
+          </w:p>
+        </w:tc>
+        <w:tc>
+          <w:tcPr>
+            <w:tcW w:w="759" w:type="pct"/>
+          </w:tcPr>
+          <w:p>
+            <w:pPr>
+              <w:spacing w:after="60"/>
+              <w:jc w:val="center"/>
+              <w:rPr>
+                <w:rFonts w:ascii="Arial" w:hAnsi="Arial" w:cs="Arial"/>
+                <w:sz w:val="20"/>
+                <w:szCs w:val="20"/>
+              </w:rPr>
+            </w:pPr>
+            <w:r>
+              <w:rPr>
+                <w:rFonts w:ascii="Arial" w:hAnsi="Arial" w:cs="Arial"/>
+                <w:sz w:val="20"/>
+                <w:szCs w:val="20"/>
+              </w:rPr>
+              <w:t>8</w:t>
+            </w:r>
+          </w:p>
+        </w:tc>
+      </w:tr>
+      <w:tr>
+        <w:trPr>
+          <w:cantSplit/>
+        </w:trPr>
+        <w:tc>
+          <w:tcPr>
+            <w:tcW w:w="4241" w:type="pct"/>
+          </w:tcPr>
+          <w:p>
+            <w:pPr>
+              <w:spacing w:after="60"/>
+              <w:jc w:val="right"/>
+            </w:pPr>
+            <w:r>
+              <w:rPr>
+                <w:rFonts w:ascii="Aptos" w:hAnsi="Aptos"/>
+                <w:sz w:val="20"/>
+                <w:szCs w:val="20"/>
+              </w:rPr>
+              <w:t>Anti-pasta</w:t>
+            </w:r>
+          </w:p>
+        </w:tc>
+        <w:tc>
+          <w:tcPr>
+            <w:tcW w:w="759" w:type="pct"/>
+          </w:tcPr>
+          <w:p>
+            <w:pPr>
+              <w:spacing w:after="60"/>
+              <w:jc w:val="center"/>
+              <w:rPr>
+                <w:rFonts w:ascii="Arial" w:hAnsi="Arial" w:cs="Arial"/>
+                <w:sz w:val="20"/>
+                <w:szCs w:val="20"/>
+              </w:rPr>
+            </w:pPr>
+            <w:r>
+              <w:rPr>
+                <w:rFonts w:ascii="Arial" w:hAnsi="Arial" w:cs="Arial"/>
+                <w:sz w:val="20"/>
+                <w:szCs w:val="20"/>
+              </w:rPr>
+              <w:t>9</w:t>
+            </w:r>
+          </w:p>
+        </w:tc>
+      </w:tr>
+      <w:tr>
+        <w:trPr>
+          <w:cantSplit/>
+        </w:trPr>
+        <w:tc>
+          <w:tcPr>
+            <w:tcW w:w="4241" w:type="pct"/>
+          </w:tcPr>
+          <w:p>
+            <w:pPr>
+              <w:spacing w:after="60"/>
+              <w:jc w:val="right"/>
               <w:rPr>
                 <w:rFonts w:ascii="Arial" w:hAnsi="Arial" w:cs="Arial"/>
                 <w:sz w:val="20"/>
@@ -1991,7 +2475,6 @@
     </w:p>
     <w:p>
       <w:pPr>
-        <w:spacing w:after="60"/>
         <w:rPr>
           <w:rFonts w:ascii="Arial" w:hAnsi="Arial" w:cs="Arial"/>
           <w:sz w:val="20"/>
@@ -2005,7 +2488,7 @@
           <w:szCs w:val="20"/>
         </w:rPr>
         <w:lastRenderedPageBreak/>
-        <w:t>Ask for Dry seasonings and spices only</w:t>
+        <w:t>Ask this for all selected categories.</w:t>
       </w:r>
     </w:p>
     <w:p>
@@ -2843,6 +3326,33 @@
           <w:szCs w:val="20"/>
         </w:rPr>
       </w:pPr>
+    </w:p>
+    <w:p>
+      <w:pPr>
+        <w:rPr>
+          <w:rFonts w:ascii="Arial" w:hAnsi="Arial" w:cs="Arial"/>
+          <w:sz w:val="20"/>
+          <w:szCs w:val="20"/>
+        </w:rPr>
+      </w:pPr>
+    </w:p>
+    <w:p>
+      <w:pPr>
+        <w:spacing w:after="60"/>
+        <w:rPr>
+          <w:rFonts w:ascii="Arial" w:hAnsi="Arial" w:cs="Arial"/>
+          <w:sz w:val="20"/>
+          <w:szCs w:val="20"/>
+        </w:rPr>
+      </w:pPr>
+      <w:r>
+        <w:rPr>
+          <w:rFonts w:ascii="Arial" w:hAnsi="Arial" w:cs="Arial"/>
+          <w:sz w:val="20"/>
+          <w:szCs w:val="20"/>
+        </w:rPr>
+        <w:t>Ask for 1 of Dry seasonings and spices, pour over sauces, pasta sauces, baking mixes only</w:t>
+      </w:r>
     </w:p>
     <w:p>
       <w:pPr>
@@ -3470,7 +3980,6 @@
           <w:sz w:val="20"/>
           <w:szCs w:val="20"/>
         </w:rPr>
-        <w:lastRenderedPageBreak/>
         <w:t>-</w:t>
       </w:r>
       <w:r>

</xml_diff>